<commit_message>
Add agreement download function
</commit_message>
<xml_diff>
--- a/templates/docs/tn_template.docx
+++ b/templates/docs/tn_template.docx
@@ -578,14 +578,7 @@
                 <w:b/>
                 <w:sz w:val="18"/>
               </w:rPr>
-              <w:t xml:space="preserve">является </w:t>
-            </w:r>
-            <w:r>
-              <w:rPr>
-                <w:b/>
-                <w:sz w:val="18"/>
-              </w:rPr>
-              <w:t>экспедитором</w:t>
+              <w:t>является экспедитором</w:t>
             </w:r>
           </w:p>
         </w:tc>
@@ -744,13 +737,7 @@
               <w:rPr>
                 <w:sz w:val="14"/>
               </w:rPr>
-              <w:t xml:space="preserve">(реквизиты, позволяющие идентифицировать Заказчика услуг по </w:t>
-            </w:r>
-            <w:r>
-              <w:rPr>
-                <w:sz w:val="14"/>
-              </w:rPr>
-              <w:t>организации перевозки груза)</w:t>
+              <w:t>(реквизиты, позволяющие идентифицировать Заказчика услуг по организации перевозки груза)</w:t>
             </w:r>
           </w:p>
         </w:tc>
@@ -893,14 +880,7 @@
                 <w:b/>
                 <w:sz w:val="18"/>
               </w:rPr>
-              <w:t xml:space="preserve">2. </w:t>
-            </w:r>
-            <w:r>
-              <w:rPr>
-                <w:b/>
-                <w:sz w:val="18"/>
-              </w:rPr>
-              <w:t>Грузополучатель</w:t>
+              <w:t>2. Грузополучатель</w:t>
             </w:r>
           </w:p>
         </w:tc>
@@ -1120,14 +1100,7 @@
                 <w:sz w:val="18"/>
                 <w:szCs w:val="18"/>
               </w:rPr>
-              <w:t xml:space="preserve">{% if cargo %}{{ cargo </w:t>
-            </w:r>
-            <w:r>
-              <w:rPr>
-                <w:sz w:val="18"/>
-                <w:szCs w:val="18"/>
-              </w:rPr>
-              <w:t>}}{% endif %}</w:t>
+              <w:t>{% if cargo %}{{ cargo }}{% endif %}</w:t>
             </w:r>
           </w:p>
         </w:tc>
@@ -1270,13 +1243,7 @@
               <w:rPr>
                 <w:sz w:val="14"/>
               </w:rPr>
-              <w:t xml:space="preserve">(масса груза брутто в </w:t>
-            </w:r>
-            <w:r>
-              <w:rPr>
-                <w:sz w:val="14"/>
-              </w:rPr>
-              <w:t>килограммах, масса груза нетто в килограммах (при возможности ее определения), размеры (высота, ширина, длина) в метрах (при</w:t>
+              <w:t>(масса груза брутто в килограммах, масса груза нетто в килограммах (при возможности ее определения), размеры (высота, ширина, длина) в метрах (при</w:t>
             </w:r>
             <w:r>
               <w:rPr>
@@ -1619,13 +1586,7 @@
               <w:rPr>
                 <w:sz w:val="14"/>
               </w:rPr>
-              <w:t xml:space="preserve">(в случае перевозки опасного груза - информация по каждому опасному веществу, материалу или изделию в соответствии с пунктом 5.4.1 </w:t>
-            </w:r>
-            <w:r>
-              <w:rPr>
-                <w:sz w:val="14"/>
-              </w:rPr>
-              <w:t>ДОПОГ)</w:t>
+              <w:t>(в случае перевозки опасного груза - информация по каждому опасному веществу, материалу или изделию в соответствии с пунктом 5.4.1 ДОПОГ)</w:t>
             </w:r>
           </w:p>
         </w:tc>
@@ -1748,13 +1709,7 @@
               <w:rPr>
                 <w:sz w:val="14"/>
               </w:rPr>
-              <w:t xml:space="preserve">(перечень прилагаемых к транспортной накладной документов, предусмотренных ДОПОГ, санитарными, таможенными (при наличии), </w:t>
-            </w:r>
-            <w:r>
-              <w:rPr>
-                <w:sz w:val="14"/>
-              </w:rPr>
-              <w:t>карантинными, иными</w:t>
+              <w:t>(перечень прилагаемых к транспортной накладной документов, предусмотренных ДОПОГ, санитарными, таможенными (при наличии), карантинными, иными</w:t>
             </w:r>
             <w:r>
               <w:rPr>
@@ -2022,13 +1977,7 @@
               <w:rPr>
                 <w:sz w:val="14"/>
               </w:rPr>
-              <w:t xml:space="preserve">(перечень прилагаемых к грузу сертификатов, паспортов качества, удостоверений и других документов, наличие которых установлено законодательством Российской Федерации, либо регистрационные номера указанных документов, если такие документы (сведения о таких </w:t>
-            </w:r>
-            <w:r>
-              <w:rPr>
-                <w:sz w:val="14"/>
-              </w:rPr>
-              <w:t>документах) содержатся</w:t>
+              <w:t>(перечень прилагаемых к грузу сертификатов, паспортов качества, удостоверений и других документов, наличие которых установлено законодательством Российской Федерации, либо регистрационные номера указанных документов, если такие документы (сведения о таких документах) содержатся</w:t>
             </w:r>
           </w:p>
           <w:p>
@@ -2104,13 +2053,7 @@
               <w:rPr>
                 <w:sz w:val="14"/>
               </w:rPr>
-              <w:t>(реквизиты, позволяющие идентифицировать документ(-ы), подтверждающий(-ие) отгрузку товаров) (при наличии), реквизиты сопроводительной ведомости (при перевозке груженых контейнеров или по</w:t>
-            </w:r>
-            <w:r>
-              <w:rPr>
-                <w:sz w:val="14"/>
-              </w:rPr>
-              <w:t>рожних контейнеров)</w:t>
+              <w:t>(реквизиты, позволяющие идентифицировать документ(-ы), подтверждающий(-ие) отгрузку товаров) (при наличии), реквизиты сопроводительной ведомости (при перевозке груженых контейнеров или порожних контейнеров)</w:t>
             </w:r>
           </w:p>
         </w:tc>
@@ -2253,13 +2196,7 @@
               <w:rPr>
                 <w:sz w:val="14"/>
               </w:rPr>
-              <w:t xml:space="preserve">(контактная информация о лицах, по указанию которых может осуществляться </w:t>
-            </w:r>
-            <w:r>
-              <w:rPr>
-                <w:sz w:val="14"/>
-              </w:rPr>
-              <w:t>переадресовка)</w:t>
+              <w:t>(контактная информация о лицах, по указанию которых может осуществляться переадресовка)</w:t>
             </w:r>
           </w:p>
         </w:tc>
@@ -2368,13 +2305,7 @@
               <w:rPr>
                 <w:sz w:val="14"/>
               </w:rPr>
-              <w:t xml:space="preserve">(температурный режим перевозки груза (при необходимости), </w:t>
-            </w:r>
-            <w:r>
-              <w:rPr>
-                <w:sz w:val="14"/>
-              </w:rPr>
-              <w:t>сведения о запорно-пломбировочных устройствах (в случае их предоставления</w:t>
+              <w:t>(температурный режим перевозки груза (при необходимости), сведения о запорно-пломбировочных устройствах (в случае их предоставления</w:t>
             </w:r>
           </w:p>
           <w:p>
@@ -2515,15 +2446,7 @@
                 <w:szCs w:val="18"/>
                 <w:lang w:val="en-US"/>
               </w:rPr>
-              <w:t>{{  driver.su</w:t>
-            </w:r>
-            <w:r>
-              <w:rPr>
-                <w:sz w:val="18"/>
-                <w:szCs w:val="18"/>
-                <w:lang w:val="en-US"/>
-              </w:rPr>
-              <w:t xml:space="preserve">rname  }} {{  driver.name  }} {{  driver.patronymic  }}{% if driver.inn %}, </w:t>
+              <w:t xml:space="preserve">{{  driver.surname  }} {{  driver.name  }} {{  driver.patronymic  }}{% if driver.inn %}, </w:t>
             </w:r>
             <w:r>
               <w:rPr>
@@ -2747,39 +2670,7 @@
                 <w:szCs w:val="18"/>
                 <w:lang w:val="en-US"/>
               </w:rPr>
-              <w:t>{% if trailer %}{{ trailer.brand }}</w:t>
-            </w:r>
-            <w:r>
-              <w:rPr>
-                <w:sz w:val="18"/>
-                <w:szCs w:val="18"/>
-                <w:lang w:val="en-US"/>
-              </w:rPr>
-              <w:t xml:space="preserve"> </w:t>
-            </w:r>
-            <w:r>
-              <w:rPr>
-                <w:sz w:val="18"/>
-                <w:szCs w:val="18"/>
-                <w:lang w:val="en-US"/>
-              </w:rPr>
-              <w:t>{{ trailer.</w:t>
-            </w:r>
-            <w:r>
-              <w:rPr>
-                <w:sz w:val="18"/>
-                <w:szCs w:val="18"/>
-                <w:lang w:val="en-US"/>
-              </w:rPr>
-              <w:t xml:space="preserve"> </w:t>
-            </w:r>
-            <w:r>
-              <w:rPr>
-                <w:sz w:val="18"/>
-                <w:szCs w:val="18"/>
-                <w:lang w:val="en-US"/>
-              </w:rPr>
-              <w:t>model }}</w:t>
+              <w:t>{% if trailer %}{{ trailer.brand }} {{ trailer. model }}</w:t>
             </w:r>
             <w:r>
               <w:rPr>
@@ -2835,23 +2726,7 @@
                 <w:szCs w:val="18"/>
                 <w:lang w:val="en-US"/>
               </w:rPr>
-              <w:t>.</w:t>
-            </w:r>
-            <w:r>
-              <w:rPr>
-                <w:sz w:val="18"/>
-                <w:szCs w:val="18"/>
-                <w:lang w:val="en-US"/>
-              </w:rPr>
-              <w:t>grn</w:t>
-            </w:r>
-            <w:r>
-              <w:rPr>
-                <w:sz w:val="18"/>
-                <w:szCs w:val="18"/>
-                <w:lang w:val="en-US"/>
-              </w:rPr>
-              <w:t xml:space="preserve">  }}</w:t>
+              <w:t>.grn  }}</w:t>
             </w:r>
           </w:p>
           <w:p>
@@ -3087,14 +2962,7 @@
                 <w:b/>
                 <w:sz w:val="18"/>
               </w:rPr>
-              <w:t xml:space="preserve">5 - </w:t>
-            </w:r>
-            <w:r>
-              <w:rPr>
-                <w:b/>
-                <w:sz w:val="18"/>
-              </w:rPr>
-              <w:t>безвозмездное пользование</w:t>
+              <w:t>5 - безвозмездное пользование</w:t>
             </w:r>
           </w:p>
         </w:tc>
@@ -3542,13 +3410,7 @@
               <w:rPr>
                 <w:sz w:val="14"/>
               </w:rPr>
-              <w:t>(наименование (ИНН) владельца объекта инфраструктуры пункта погрузк</w:t>
-            </w:r>
-            <w:r>
-              <w:rPr>
-                <w:sz w:val="14"/>
-              </w:rPr>
-              <w:t>и)</w:t>
+              <w:t>(наименование (ИНН) владельца объекта инфраструктуры пункта погрузки)</w:t>
             </w:r>
           </w:p>
         </w:tc>
@@ -3584,7 +3446,7 @@
                 <w:szCs w:val="18"/>
                 <w:lang w:val="en-US"/>
               </w:rPr>
-              <w:t>{% if consignor %}{{  consignor.address  }}{% endif %}</w:t>
+              <w:t>{{ loading_address }}</w:t>
             </w:r>
           </w:p>
         </w:tc>
@@ -3615,7 +3477,7 @@
                 <w:szCs w:val="18"/>
                 <w:lang w:val="en-US"/>
               </w:rPr>
-              <w:t>{% if planned_loading_date %}{{  planned_loading_date  }}{% endif %}</w:t>
+              <w:t>{{ unloading_address }}</w:t>
             </w:r>
           </w:p>
         </w:tc>
@@ -3759,13 +3621,7 @@
               <w:rPr>
                 <w:sz w:val="14"/>
               </w:rPr>
-              <w:t xml:space="preserve">(фактические дата и время </w:t>
-            </w:r>
-            <w:r>
-              <w:rPr>
-                <w:sz w:val="14"/>
-              </w:rPr>
-              <w:t>прибытия под погрузку)</w:t>
+              <w:t>(фактические дата и время прибытия под погрузку)</w:t>
             </w:r>
           </w:p>
         </w:tc>
@@ -3935,13 +3791,7 @@
               <w:rPr>
                 <w:sz w:val="14"/>
               </w:rPr>
-              <w:t>(масса груза брутто в килограммах и метод ее определения (определение разницы между массой транспортного средства после погрузки и перед погрузкой</w:t>
-            </w:r>
-            <w:r>
-              <w:rPr>
-                <w:sz w:val="14"/>
-              </w:rPr>
-              <w:t xml:space="preserve"> по общей массе или взвешиванием поосно или расчетная масса груза)</w:t>
+              <w:t>(масса груза брутто в килограммах и метод ее определения (определение разницы между массой транспортного средства после погрузки и перед погрузкой по общей массе или взвешиванием поосно или расчетная масса груза)</w:t>
             </w:r>
           </w:p>
         </w:tc>
@@ -4945,13 +4795,7 @@
               <w:rPr>
                 <w:sz w:val="14"/>
               </w:rPr>
-              <w:t xml:space="preserve">(дата, вид </w:t>
-            </w:r>
-            <w:r>
-              <w:rPr>
-                <w:sz w:val="14"/>
-              </w:rPr>
-              <w:t>переадресовки на бумажном носителе или в электронном виде (с указанием вида доставки документа)</w:t>
+              <w:t>(дата, вид переадресовки на бумажном носителе или в электронном виде (с указанием вида доставки документа)</w:t>
             </w:r>
           </w:p>
         </w:tc>
@@ -5060,13 +4904,7 @@
               <w:rPr>
                 <w:sz w:val="14"/>
               </w:rPr>
-              <w:t xml:space="preserve">(реквизиты лица, от которого получено указание на </w:t>
-            </w:r>
-            <w:r>
-              <w:rPr>
-                <w:sz w:val="14"/>
-              </w:rPr>
-              <w:t>переадресовку)</w:t>
+              <w:t>(реквизиты лица, от которого получено указание на переадресовку)</w:t>
             </w:r>
           </w:p>
         </w:tc>
@@ -5230,13 +5068,7 @@
               <w:rPr>
                 <w:sz w:val="14"/>
               </w:rPr>
-              <w:t xml:space="preserve">(адрес места </w:t>
-            </w:r>
-            <w:r>
-              <w:rPr>
-                <w:sz w:val="14"/>
-              </w:rPr>
-              <w:t>выгрузки)</w:t>
+              <w:t>(адрес места выгрузки)</w:t>
             </w:r>
           </w:p>
         </w:tc>
@@ -5482,13 +5314,7 @@
               <w:rPr>
                 <w:sz w:val="14"/>
               </w:rPr>
-              <w:t xml:space="preserve">(количество </w:t>
-            </w:r>
-            <w:r>
-              <w:rPr>
-                <w:sz w:val="14"/>
-              </w:rPr>
-              <w:t>грузовых мест)</w:t>
+              <w:t>(количество грузовых мест)</w:t>
             </w:r>
           </w:p>
         </w:tc>
@@ -5819,13 +5645,7 @@
               <w:rPr>
                 <w:sz w:val="14"/>
               </w:rPr>
-              <w:t>(оговорки и замечания перевозчика (при наличии) о дате и вре</w:t>
-            </w:r>
-            <w:r>
-              <w:rPr>
-                <w:sz w:val="14"/>
-              </w:rPr>
-              <w:t>мени</w:t>
+              <w:t>(оговорки и замечания перевозчика (при наличии) о дате и времени</w:t>
             </w:r>
           </w:p>
           <w:p>
@@ -6069,13 +5889,7 @@
               <w:rPr>
                 <w:sz w:val="14"/>
               </w:rPr>
-              <w:t xml:space="preserve">(должность, подпись, </w:t>
-            </w:r>
-            <w:r>
-              <w:rPr>
-                <w:sz w:val="14"/>
-              </w:rPr>
-              <w:t>расшифровка подписи грузополучателя или уполномоченного грузоотправителем лица)</w:t>
+              <w:t>(должность, подпись, расшифровка подписи грузополучателя или уполномоченного грузоотправителем лица)</w:t>
             </w:r>
           </w:p>
         </w:tc>
@@ -6138,14 +5952,7 @@
                 <w:b/>
                 <w:sz w:val="18"/>
               </w:rPr>
-              <w:t xml:space="preserve">11. Отметки грузоотправителей, грузополучателей, перевозчиков </w:t>
-            </w:r>
-            <w:r>
-              <w:rPr>
-                <w:b/>
-                <w:sz w:val="18"/>
-              </w:rPr>
-              <w:t>(при необходимости)</w:t>
+              <w:t>11. Отметки грузоотправителей, грузополучателей, перевозчиков (при необходимости)</w:t>
             </w:r>
           </w:p>
         </w:tc>
@@ -6337,14 +6144,7 @@
                 <w:b/>
                 <w:sz w:val="18"/>
               </w:rPr>
-              <w:t xml:space="preserve">12. Стоимость перевозки груза (установленная плата) в рублях (при </w:t>
-            </w:r>
-            <w:r>
-              <w:rPr>
-                <w:b/>
-                <w:sz w:val="18"/>
-              </w:rPr>
-              <w:t>необходимости)</w:t>
+              <w:t>12. Стоимость перевозки груза (установленная плата) в рублях (при необходимости)</w:t>
             </w:r>
           </w:p>
         </w:tc>
@@ -7052,13 +6852,7 @@
               <w:rPr>
                 <w:sz w:val="14"/>
               </w:rPr>
-              <w:t xml:space="preserve">(основание, по которому Экономический субъект </w:t>
-            </w:r>
-            <w:r>
-              <w:rPr>
-                <w:sz w:val="14"/>
-              </w:rPr>
-              <w:t>является составителем документа о факте хозяйственной жизни)</w:t>
+              <w:t>(основание, по которому Экономический субъект является составителем документа о факте хозяйственной жизни)</w:t>
             </w:r>
           </w:p>
         </w:tc>
@@ -7248,13 +7042,7 @@
               <w:rPr>
                 <w:sz w:val="14"/>
               </w:rPr>
-              <w:t xml:space="preserve">(подпись, расшифровка подписи лица, ответственного за оформление факта </w:t>
-            </w:r>
-            <w:r>
-              <w:rPr>
-                <w:sz w:val="14"/>
-              </w:rPr>
-              <w:t>хозяйственной жизни со стороны Перевозчика (уполномоченного лица)</w:t>
+              <w:t>(подпись, расшифровка подписи лица, ответственного за оформление факта хозяйственной жизни со стороны Перевозчика (уполномоченного лица)</w:t>
             </w:r>
           </w:p>
         </w:tc>
@@ -7362,13 +7150,7 @@
               <w:rPr>
                 <w:sz w:val="14"/>
               </w:rPr>
-              <w:t xml:space="preserve">(должность, основание полномочий </w:t>
-            </w:r>
-            <w:r>
-              <w:rPr>
-                <w:sz w:val="14"/>
-              </w:rPr>
-              <w:t>физического лица, уполномоченного Перевозчиком (уполномоченным лицом), дата подписания)</w:t>
+              <w:t>(должность, основание полномочий физического лица, уполномоченного Перевозчиком (уполномоченным лицом), дата подписания)</w:t>
             </w:r>
           </w:p>
         </w:tc>

</xml_diff>

<commit_message>
Add column view settings button
</commit_message>
<xml_diff>
--- a/templates/docs/tn_template.docx
+++ b/templates/docs/tn_template.docx
@@ -3477,7 +3477,7 @@
                 <w:szCs w:val="18"/>
                 <w:lang w:val="en-US"/>
               </w:rPr>
-              <w:t>{{ unloading_address }}</w:t>
+              <w:t>{{  planned_loading_date  }}</w:t>
             </w:r>
           </w:p>
         </w:tc>
@@ -5003,7 +5003,23 @@
                 <w:szCs w:val="18"/>
                 <w:lang w:val="en-US"/>
               </w:rPr>
-              <w:t>{% if consignee %}{{  consignee.address  }}{% endif %}</w:t>
+              <w:t xml:space="preserve">{{ </w:t>
+            </w:r>
+            <w:r>
+              <w:rPr>
+                <w:sz w:val="18"/>
+                <w:szCs w:val="18"/>
+                <w:lang w:val="en-US"/>
+              </w:rPr>
+              <w:t>un</w:t>
+            </w:r>
+            <w:r>
+              <w:rPr>
+                <w:sz w:val="18"/>
+                <w:szCs w:val="18"/>
+                <w:lang w:val="en-US"/>
+              </w:rPr>
+              <w:t>loading_address }}</w:t>
             </w:r>
           </w:p>
         </w:tc>
@@ -5034,7 +5050,7 @@
                 <w:szCs w:val="18"/>
                 <w:lang w:val="en-US"/>
               </w:rPr>
-              <w:t>{% if planned_unloading_date %}{{  planned_unloading_date  }}{% endif %}</w:t>
+              <w:t>{{  planned_unloading_date  }}</w:t>
             </w:r>
           </w:p>
         </w:tc>
@@ -5711,32 +5727,14 @@
               <w:jc w:val="right"/>
               <w:rPr>
                 <w:sz w:val="14"/>
-                <w:lang w:val="en-US"/>
-              </w:rPr>
-            </w:pPr>
-            <w:r>
-              <w:rPr>
-                <w:sz w:val="18"/>
-                <w:szCs w:val="18"/>
-                <w:lang w:val="en-US"/>
-              </w:rPr>
-              <w:t xml:space="preserve">{% </w:t>
-            </w:r>
-            <w:r>
-              <w:rPr>
-                <w:sz w:val="18"/>
-                <w:szCs w:val="18"/>
-                <w:lang w:val="en-US"/>
-              </w:rPr>
-              <w:t>if</w:t>
-            </w:r>
-            <w:r>
-              <w:rPr>
-                <w:sz w:val="18"/>
-                <w:szCs w:val="18"/>
-                <w:lang w:val="en-US"/>
-              </w:rPr>
-              <w:t xml:space="preserve"> </w:t>
+              </w:rPr>
+            </w:pPr>
+            <w:r>
+              <w:rPr>
+                <w:sz w:val="18"/>
+                <w:szCs w:val="18"/>
+              </w:rPr>
+              <w:t xml:space="preserve">{{  </w:t>
             </w:r>
             <w:r>
               <w:rPr>
@@ -5750,9 +5748,23 @@
               <w:rPr>
                 <w:sz w:val="18"/>
                 <w:szCs w:val="18"/>
-                <w:lang w:val="en-US"/>
-              </w:rPr>
-              <w:t xml:space="preserve"> %}{{  </w:t>
+              </w:rPr>
+              <w:t>.</w:t>
+            </w:r>
+            <w:r>
+              <w:rPr>
+                <w:sz w:val="18"/>
+                <w:szCs w:val="18"/>
+                <w:lang w:val="en-US"/>
+              </w:rPr>
+              <w:t>surname</w:t>
+            </w:r>
+            <w:r>
+              <w:rPr>
+                <w:sz w:val="18"/>
+                <w:szCs w:val="18"/>
+              </w:rPr>
+              <w:t xml:space="preserve">  }} {{  </w:t>
             </w:r>
             <w:r>
               <w:rPr>
@@ -5766,7 +5778,6 @@
               <w:rPr>
                 <w:sz w:val="18"/>
                 <w:szCs w:val="18"/>
-                <w:lang w:val="en-US"/>
               </w:rPr>
               <w:t>.</w:t>
             </w:r>
@@ -5776,13 +5787,12 @@
                 <w:szCs w:val="18"/>
                 <w:lang w:val="en-US"/>
               </w:rPr>
-              <w:t>surname</w:t>
-            </w:r>
-            <w:r>
-              <w:rPr>
-                <w:sz w:val="18"/>
-                <w:szCs w:val="18"/>
-                <w:lang w:val="en-US"/>
+              <w:t>name</w:t>
+            </w:r>
+            <w:r>
+              <w:rPr>
+                <w:sz w:val="18"/>
+                <w:szCs w:val="18"/>
               </w:rPr>
               <w:t xml:space="preserve">  }} {{  </w:t>
             </w:r>
@@ -5798,7 +5808,6 @@
               <w:rPr>
                 <w:sz w:val="18"/>
                 <w:szCs w:val="18"/>
-                <w:lang w:val="en-US"/>
               </w:rPr>
               <w:t>.</w:t>
             </w:r>
@@ -5808,55 +5817,14 @@
                 <w:szCs w:val="18"/>
                 <w:lang w:val="en-US"/>
               </w:rPr>
-              <w:t>name</w:t>
-            </w:r>
-            <w:r>
-              <w:rPr>
-                <w:sz w:val="18"/>
-                <w:szCs w:val="18"/>
-                <w:lang w:val="en-US"/>
-              </w:rPr>
-              <w:t xml:space="preserve">  }} {{  </w:t>
-            </w:r>
-            <w:r>
-              <w:rPr>
-                <w:sz w:val="18"/>
-                <w:szCs w:val="18"/>
-                <w:lang w:val="en-US"/>
-              </w:rPr>
-              <w:t>driver</w:t>
-            </w:r>
-            <w:r>
-              <w:rPr>
-                <w:sz w:val="18"/>
-                <w:szCs w:val="18"/>
-                <w:lang w:val="en-US"/>
-              </w:rPr>
-              <w:t>.</w:t>
-            </w:r>
-            <w:r>
-              <w:rPr>
-                <w:sz w:val="18"/>
-                <w:szCs w:val="18"/>
-                <w:lang w:val="en-US"/>
-              </w:rPr>
               <w:t>patronymic</w:t>
             </w:r>
             <w:r>
               <w:rPr>
                 <w:sz w:val="18"/>
                 <w:szCs w:val="18"/>
-                <w:lang w:val="en-US"/>
               </w:rPr>
               <w:t xml:space="preserve">  }}</w:t>
-            </w:r>
-            <w:r>
-              <w:rPr>
-                <w:sz w:val="18"/>
-                <w:szCs w:val="18"/>
-                <w:lang w:val="en-US"/>
-              </w:rPr>
-              <w:t>{% endif %}</w:t>
             </w:r>
           </w:p>
         </w:tc>

</xml_diff>